<commit_message>
Wi-Fi Settings editor (wpaconf) + per-app app.txt; uikit textbox + kapi_reboot (ABI v25)
- uikit.h: UI_TEXTBOX single-line input (caret, Backspace/Del, arrows,
  Home/End, Tab focus, optional password mask); ui_textbox / ui_get_text /
  ui_set_password.
- kapi_reboot (ABI v25 -> Circle reboot()): apply settings the kernel only
  reads at boot.
- wpaconf "Wi-Fi Settings" app: edit SSID/psk/country/proto/key_mgmt in
  SD:/etc/wpa_supplicant.conf; Save regenerates the file from a canonical
  template; Save & Reboot applies it (CWPASupplicant has no live reload).
  Writes only the SD working copy -- the committed psk stays redacted.
- app.txt (name + category) in every apps/<name>.app/ for a future
  category-grouping launcher; panel/applist -> category Shell.
- docs 02/03/04 + exports synced; render.py app_wpaconf + screenshot.

Co-Authored-By: Claude Opus 4.8 <noreply@anthropic.com>
</commit_message>
<xml_diff>
--- a/docs/exports/02-KERNEL-INTERNALS.docx
+++ b/docs/exports/02-KERNEL-INTERNALS.docx
@@ -6898,7 +6898,7 @@
         <w:rPr>
           <w:rStyle w:val="VerbatimChar"/>
         </w:rPr>
-        <w:t xml:space="preserve">KAPI_ABI_VERSION = 22</w:t>
+        <w:t xml:space="preserve">KAPI_ABI_VERSION = 25</w:t>
       </w:r>
       <w:r>
         <w:t xml:space="preserve">. The</w:t>
@@ -7138,6 +7138,18 @@
           <w:rStyle w:val="VerbatimChar"/>
         </w:rPr>
         <w:t xml:space="preserve">sbrk</w:t>
+      </w:r>
+      <w:r>
+        <w:t xml:space="preserve">, v25 =</w:t>
+      </w:r>
+      <w:r>
+        <w:t xml:space="preserve"> </w:t>
+      </w:r>
+      <w:r>
+        <w:rPr>
+          <w:rStyle w:val="VerbatimChar"/>
+        </w:rPr>
+        <w:t xml:space="preserve">reboot</w:t>
       </w:r>
       <w:r>
         <w:t xml:space="preserve">).</w:t>
@@ -8170,6 +8182,52 @@
                 <w:rStyle w:val="VerbatimChar"/>
               </w:rPr>
               <w:t xml:space="preserve">tcp_close</w:t>
+            </w:r>
+          </w:p>
+        </w:tc>
+      </w:tr>
+      <w:tr>
+        <w:tc>
+          <w:tcPr/>
+          <w:p>
+            <w:pPr>
+              <w:pStyle w:val="Compact"/>
+            </w:pPr>
+            <w:r>
+              <w:t xml:space="preserve">Power (v25)</w:t>
+            </w:r>
+          </w:p>
+        </w:tc>
+        <w:tc>
+          <w:tcPr/>
+          <w:p>
+            <w:pPr>
+              <w:pStyle w:val="Compact"/>
+            </w:pPr>
+            <w:r>
+              <w:rPr>
+                <w:rStyle w:val="VerbatimChar"/>
+              </w:rPr>
+              <w:t xml:space="preserve">reboot</w:t>
+            </w:r>
+            <w:r>
+              <w:t xml:space="preserve"> </w:t>
+            </w:r>
+            <w:r>
+              <w:t xml:space="preserve">(restart the machine — applies settings read only at boot, e.g. the WLAN config rewritten by</w:t>
+            </w:r>
+            <w:r>
+              <w:t xml:space="preserve"> </w:t>
+            </w:r>
+            <w:r>
+              <w:rPr>
+                <w:i/>
+                <w:iCs/>
+              </w:rPr>
+              <w:t xml:space="preserve">wpaconf</w:t>
+            </w:r>
+            <w:r>
+              <w:t xml:space="preserve">)</w:t>
             </w:r>
           </w:p>
         </w:tc>
@@ -12479,7 +12537,7 @@
               <w:pStyle w:val="Compact"/>
             </w:pPr>
             <w:r>
-              <w:t xml:space="preserve">24</w:t>
+              <w:t xml:space="preserve">25</w:t>
             </w:r>
           </w:p>
         </w:tc>

</xml_diff>

<commit_message>
Keyboard layout app-driven (kbd_ready, ABI v26) + wpaconf reboot confirm + config scrollbar
- Keyboard: the kernel no longer applies any layout from cmdline (keymap= dropped
  from cmdline.txt). Userspace owns it -- kapi_kbd_ready (v26) lets the autostart
  `keyb FR` tool poll until the USB keyboard has enumerated, then apply the layout.
  Fixes the boot race where keyb/cmdline ran before the keyboard was up.
- wpaconf: "Save & Reboot" now saves, then asks via a modal Yes/No (kapi_message_box)
  before rebooting; No just keeps the saved file.
- config: the app list gets a real scrollbar (click-to-jump), so apps past the first
  page are reachable by mouse; free-scroll independent of the keyboard selection.
- docs 02 (ABI v26) + 04 (keyboard section) + exports.

Co-Authored-By: Claude Opus 4.8 <noreply@anthropic.com>
</commit_message>
<xml_diff>
--- a/docs/exports/02-KERNEL-INTERNALS.docx
+++ b/docs/exports/02-KERNEL-INTERNALS.docx
@@ -6898,7 +6898,7 @@
         <w:rPr>
           <w:rStyle w:val="VerbatimChar"/>
         </w:rPr>
-        <w:t xml:space="preserve">KAPI_ABI_VERSION = 25</w:t>
+        <w:t xml:space="preserve">KAPI_ABI_VERSION = 26</w:t>
       </w:r>
       <w:r>
         <w:t xml:space="preserve">. The</w:t>
@@ -7150,6 +7150,24 @@
           <w:rStyle w:val="VerbatimChar"/>
         </w:rPr>
         <w:t xml:space="preserve">reboot</w:t>
+      </w:r>
+      <w:r>
+        <w:t xml:space="preserve">,</w:t>
+      </w:r>
+      <w:r>
+        <w:t xml:space="preserve"> </w:t>
+      </w:r>
+      <w:r>
+        <w:t xml:space="preserve">v26 =</w:t>
+      </w:r>
+      <w:r>
+        <w:t xml:space="preserve"> </w:t>
+      </w:r>
+      <w:r>
+        <w:rPr>
+          <w:rStyle w:val="VerbatimChar"/>
+        </w:rPr>
+        <w:t xml:space="preserve">kbd_ready</w:t>
       </w:r>
       <w:r>
         <w:t xml:space="preserve">).</w:t>
@@ -8014,6 +8032,36 @@
             </w:r>
             <w:r>
               <w:t xml:space="preserve">,</w:t>
+            </w:r>
+            <w:r>
+              <w:t xml:space="preserve"> </w:t>
+            </w:r>
+            <w:r>
+              <w:rPr>
+                <w:rStyle w:val="VerbatimChar"/>
+              </w:rPr>
+              <w:t xml:space="preserve">kbd_ready</w:t>
+            </w:r>
+            <w:r>
+              <w:t xml:space="preserve"> </w:t>
+            </w:r>
+            <w:r>
+              <w:t xml:space="preserve">(USB keyboard attached? — the</w:t>
+            </w:r>
+            <w:r>
+              <w:t xml:space="preserve"> </w:t>
+            </w:r>
+            <w:r>
+              <w:rPr>
+                <w:rStyle w:val="VerbatimChar"/>
+              </w:rPr>
+              <w:t xml:space="preserve">keyb</w:t>
+            </w:r>
+            <w:r>
+              <w:t xml:space="preserve"> </w:t>
+            </w:r>
+            <w:r>
+              <w:t xml:space="preserve">tool polls it at boot, v26),</w:t>
             </w:r>
             <w:r>
               <w:t xml:space="preserve"> </w:t>
@@ -12537,7 +12585,7 @@
               <w:pStyle w:val="Compact"/>
             </w:pPr>
             <w:r>
-              <w:t xml:space="preserve">25</w:t>
+              <w:t xml:space="preserve">26</w:t>
             </w:r>
           </w:p>
         </w:tc>

</xml_diff>

<commit_message>
Keymaps as /etc/keymaps/*.kmap files (ABI v27 set_keymap_data) -- add layouts without rebuilding
- Keyboard layouts are now data, not compiled-in: SD:/etc/keymaps/<NAME>.kmap
  (binary "OKM1" header + u16[128][5] table). The `keyb` tool reads the file and
  hands the bytes to the kernel (kapi_set_keymap_data, v27), which copies each entry
  into the live keyboard via the public CKeyMap::SetEntry -- no Circle patch needed.
  Missing file -> falls back to the compiled-in country map.
- tools/keymaps/genkeymaps.py seeds the 7 stock layouts (DE/DV/ES/FR/IT/UK/US)
  straight from circle/lib/input/keymap_*.h, so they match byte-for-byte. New layouts
  just need a new .kmap dropped in /etc/keymaps -- no kernel rebuild.
- docs 02 (ABI v27) + 03 (.kmap format + generator) + 04 (keymaps section) + exports.

Co-Authored-By: Claude Opus 4.8 <noreply@anthropic.com>
</commit_message>
<xml_diff>
--- a/docs/exports/02-KERNEL-INTERNALS.docx
+++ b/docs/exports/02-KERNEL-INTERNALS.docx
@@ -6898,7 +6898,7 @@
         <w:rPr>
           <w:rStyle w:val="VerbatimChar"/>
         </w:rPr>
-        <w:t xml:space="preserve">KAPI_ABI_VERSION = 26</w:t>
+        <w:t xml:space="preserve">KAPI_ABI_VERSION = 27</w:t>
       </w:r>
       <w:r>
         <w:t xml:space="preserve">. The</w:t>
@@ -7168,6 +7168,18 @@
           <w:rStyle w:val="VerbatimChar"/>
         </w:rPr>
         <w:t xml:space="preserve">kbd_ready</w:t>
+      </w:r>
+      <w:r>
+        <w:t xml:space="preserve">, v27 =</w:t>
+      </w:r>
+      <w:r>
+        <w:t xml:space="preserve"> </w:t>
+      </w:r>
+      <w:r>
+        <w:rPr>
+          <w:rStyle w:val="VerbatimChar"/>
+        </w:rPr>
+        <w:t xml:space="preserve">set_keymap_data</w:t>
       </w:r>
       <w:r>
         <w:t xml:space="preserve">).</w:t>
@@ -8062,6 +8074,36 @@
             </w:r>
             <w:r>
               <w:t xml:space="preserve">tool polls it at boot, v26),</w:t>
+            </w:r>
+            <w:r>
+              <w:t xml:space="preserve"> </w:t>
+            </w:r>
+            <w:r>
+              <w:rPr>
+                <w:rStyle w:val="VerbatimChar"/>
+              </w:rPr>
+              <w:t xml:space="preserve">set_keymap_data</w:t>
+            </w:r>
+            <w:r>
+              <w:t xml:space="preserve"> </w:t>
+            </w:r>
+            <w:r>
+              <w:t xml:space="preserve">(load a layout from a</w:t>
+            </w:r>
+            <w:r>
+              <w:t xml:space="preserve"> </w:t>
+            </w:r>
+            <w:r>
+              <w:rPr>
+                <w:rStyle w:val="VerbatimChar"/>
+              </w:rPr>
+              <w:t xml:space="preserve">.kmap</w:t>
+            </w:r>
+            <w:r>
+              <w:t xml:space="preserve"> </w:t>
+            </w:r>
+            <w:r>
+              <w:t xml:space="preserve">blob, v27),</w:t>
             </w:r>
             <w:r>
               <w:t xml:space="preserve"> </w:t>
@@ -12585,7 +12627,7 @@
               <w:pStyle w:val="Compact"/>
             </w:pPr>
             <w:r>
-              <w:t xml:space="preserve">26</w:t>
+              <w:t xml:space="preserve">27</w:t>
             </w:r>
           </w:p>
         </w:tc>

</xml_diff>

<commit_message>
docs(circle-changes): show the real fork diff per patch + rebuild exports
05-CIRCLE-CHANGES.md now embeds the actual `git diff Step51..onyx` hunks under
each patch:
  1. keyboard map decoupled from the kernel (no compiled-in country maps; 7
     keymap_*.h tables deleted) + MAX_TASKS 20->40
  2. heap large-block reuse (power-of-two free lists) + free-list byte accounting
  3. page-allocator / memory free-space accessors for the meminfo kapi
Also reflects that Circle is now a git submodule (stephaneweg/circle, branch
onyx) rather than a separately-cloned tree, and updates the "update the fork"
steps accordingly. Word/PDF exports regenerated.

(02-KERNEL-INTERNALS was already resynced to ABI v27 + the network subsystem
section, so no change there.)

Co-Authored-By: Claude Opus 4.8 <noreply@anthropic.com>
</commit_message>
<xml_diff>
--- a/docs/exports/02-KERNEL-INTERNALS.docx
+++ b/docs/exports/02-KERNEL-INTERNALS.docx
@@ -1638,37 +1638,118 @@
         </w:numPr>
       </w:pPr>
       <w:r>
-        <w:t xml:space="preserve">Reads</w:t>
-      </w:r>
-      <w:r>
-        <w:t xml:space="preserve"> </w:t>
-      </w:r>
-      <w:r>
-        <w:rPr>
-          <w:rStyle w:val="VerbatimChar"/>
-        </w:rPr>
-        <w:t xml:space="preserve">SD:apps/autostart.txt</w:t>
-      </w:r>
-      <w:r>
-        <w:t xml:space="preserve"> </w:t>
-      </w:r>
-      <w:r>
-        <w:t xml:space="preserve">and launches one task per line (</w:t>
-      </w:r>
-      <w:r>
-        <w:rPr>
-          <w:rStyle w:val="VerbatimChar"/>
-        </w:rPr>
-        <w:t xml:space="preserve">LaunchApp</w:t>
-      </w:r>
-      <w:r>
-        <w:t xml:space="preserve">).</w:t>
-      </w:r>
-      <w:r>
-        <w:t xml:space="preserve"> </w:t>
-      </w:r>
-      <w:r>
-        <w:t xml:space="preserve">By default:</w:t>
+        <w:t xml:space="preserve">Launches the</w:t>
+      </w:r>
+      <w:r>
+        <w:t xml:space="preserve"> </w:t>
+      </w:r>
+      <w:r>
+        <w:rPr>
+          <w:b/>
+          <w:bCs/>
+        </w:rPr>
+        <w:t xml:space="preserve">init program</w:t>
+      </w:r>
+      <w:r>
+        <w:t xml:space="preserve"> </w:t>
+      </w:r>
+      <w:r>
+        <w:t xml:space="preserve">(</w:t>
+      </w:r>
+      <w:r>
+        <w:rPr>
+          <w:rStyle w:val="VerbatimChar"/>
+        </w:rPr>
+        <w:t xml:space="preserve">StartAutostart</w:t>
+      </w:r>
+      <w:r>
+        <w:t xml:space="preserve">): the ELF named by the</w:t>
+      </w:r>
+      <w:r>
+        <w:t xml:space="preserve"> </w:t>
+      </w:r>
+      <w:r>
+        <w:rPr>
+          <w:rStyle w:val="VerbatimChar"/>
+        </w:rPr>
+        <w:t xml:space="preserve">cmdline.txt</w:t>
+      </w:r>
+      <w:r>
+        <w:t xml:space="preserve"> </w:t>
+      </w:r>
+      <w:r>
+        <w:t xml:space="preserve">option</w:t>
+      </w:r>
+      <w:r>
+        <w:t xml:space="preserve"> </w:t>
+      </w:r>
+      <w:r>
+        <w:rPr>
+          <w:rStyle w:val="VerbatimChar"/>
+          <w:b/>
+          <w:bCs/>
+        </w:rPr>
+        <w:t xml:space="preserve">init=</w:t>
+      </w:r>
+      <w:r>
+        <w:t xml:space="preserve"> </w:t>
+      </w:r>
+      <w:r>
+        <w:t xml:space="preserve">(e.g.</w:t>
+      </w:r>
+      <w:r>
+        <w:t xml:space="preserve"> </w:t>
+      </w:r>
+      <w:r>
+        <w:rPr>
+          <w:rStyle w:val="VerbatimChar"/>
+        </w:rPr>
+        <w:t xml:space="preserve">init=SD:/bin/init.elf</w:t>
+      </w:r>
+      <w:r>
+        <w:t xml:space="preserve">), defaulting to</w:t>
+      </w:r>
+      <w:r>
+        <w:t xml:space="preserve"> </w:t>
+      </w:r>
+      <w:r>
+        <w:rPr>
+          <w:rStyle w:val="VerbatimChar"/>
+        </w:rPr>
+        <w:t xml:space="preserve">SD:bin/init.elf</w:t>
+      </w:r>
+      <w:r>
+        <w:t xml:space="preserve"> </w:t>
+      </w:r>
+      <w:r>
+        <w:t xml:space="preserve">when the option is absent. The kernel does not parse any launch list itself —</w:t>
+      </w:r>
+      <w:r>
+        <w:t xml:space="preserve"> </w:t>
+      </w:r>
+      <w:r>
+        <w:t xml:space="preserve">init (PID-1 style) reads</w:t>
+      </w:r>
+      <w:r>
+        <w:t xml:space="preserve"> </w:t>
+      </w:r>
+      <w:r>
+        <w:rPr>
+          <w:rStyle w:val="VerbatimChar"/>
+        </w:rPr>
+        <w:t xml:space="preserve">SD:/etc/autostart</w:t>
+      </w:r>
+      <w:r>
+        <w:t xml:space="preserve"> </w:t>
+      </w:r>
+      <w:r>
+        <w:t xml:space="preserve">and starts everything from there</w:t>
+      </w:r>
+      <w:r>
+        <w:t xml:space="preserve"> </w:t>
+      </w:r>
+      <w:r>
+        <w:t xml:space="preserve">(by default</w:t>
       </w:r>
       <w:r>
         <w:t xml:space="preserve"> </w:t>
@@ -1680,10 +1761,7 @@
         <w:t xml:space="preserve">voronoy</w:t>
       </w:r>
       <w:r>
-        <w:t xml:space="preserve"> </w:t>
-      </w:r>
-      <w:r>
-        <w:t xml:space="preserve">(paints the wallpaper then exits) and</w:t>
+        <w:t xml:space="preserve">, which paints the wallpaper then exits, and</w:t>
       </w:r>
       <w:r>
         <w:t xml:space="preserve"> </w:t>
@@ -1695,10 +1773,34 @@
         <w:t xml:space="preserve">panel</w:t>
       </w:r>
       <w:r>
-        <w:t xml:space="preserve"> </w:t>
-      </w:r>
-      <w:r>
-        <w:t xml:space="preserve">(the shell).</w:t>
+        <w:t xml:space="preserve">, the</w:t>
+      </w:r>
+      <w:r>
+        <w:t xml:space="preserve"> </w:t>
+      </w:r>
+      <w:r>
+        <w:t xml:space="preserve">shell). Pointing</w:t>
+      </w:r>
+      <w:r>
+        <w:t xml:space="preserve"> </w:t>
+      </w:r>
+      <w:r>
+        <w:rPr>
+          <w:rStyle w:val="VerbatimChar"/>
+        </w:rPr>
+        <w:t xml:space="preserve">init=</w:t>
+      </w:r>
+      <w:r>
+        <w:t xml:space="preserve"> </w:t>
+      </w:r>
+      <w:r>
+        <w:t xml:space="preserve">at a different ELF swaps the whole userland launcher</w:t>
+      </w:r>
+      <w:r>
+        <w:t xml:space="preserve"> </w:t>
+      </w:r>
+      <w:r>
+        <w:t xml:space="preserve">(e.g. a recovery shell) without rebuilding the kernel.</w:t>
       </w:r>
     </w:p>
     <w:p>
@@ -8031,7 +8133,54 @@
               <w:t xml:space="preserve">set_keymap</w:t>
             </w:r>
             <w:r>
-              <w:t xml:space="preserve">,</w:t>
+              <w:t xml:space="preserve"> </w:t>
+            </w:r>
+            <w:r>
+              <w:t xml:space="preserve">(load a country map</w:t>
+            </w:r>
+            <w:r>
+              <w:t xml:space="preserve"> </w:t>
+            </w:r>
+            <w:r>
+              <w:rPr>
+                <w:i/>
+                <w:iCs/>
+              </w:rPr>
+              <w:t xml:space="preserve">by name</w:t>
+            </w:r>
+            <w:r>
+              <w:t xml:space="preserve"> </w:t>
+            </w:r>
+            <w:r>
+              <w:t xml:space="preserve">— deprecated: the kernel compiles in</w:t>
+            </w:r>
+            <w:r>
+              <w:t xml:space="preserve"> </w:t>
+            </w:r>
+            <w:r>
+              <w:rPr>
+                <w:b/>
+                <w:bCs/>
+              </w:rPr>
+              <w:t xml:space="preserve">no</w:t>
+            </w:r>
+            <w:r>
+              <w:t xml:space="preserve"> </w:t>
+            </w:r>
+            <w:r>
+              <w:t xml:space="preserve">maps, so it always returns 0; use</w:t>
+            </w:r>
+            <w:r>
+              <w:t xml:space="preserve"> </w:t>
+            </w:r>
+            <w:r>
+              <w:rPr>
+                <w:rStyle w:val="VerbatimChar"/>
+              </w:rPr>
+              <w:t xml:space="preserve">set_keymap_data</w:t>
+            </w:r>
+            <w:r>
+              <w:t xml:space="preserve">),</w:t>
             </w:r>
             <w:r>
               <w:t xml:space="preserve"> </w:t>

</xml_diff>